<commit_message>
Update documentation files and reports
</commit_message>
<xml_diff>
--- a/AGENT.md.docx
+++ b/AGENT.md.docx
@@ -28,6 +28,82 @@
           <w:rtl w:val="0"/>
         </w:rPr>
         <w:t xml:space="preserve">)</w:t>
+      </w:r>
+    </w:p>
+    <w:p>
+      <w:pPr>
+        <w:rPr/>
+      </w:pPr>
+      <w:r>
+        <w:rPr>
+          <w:b w:val="1"/>
+          <w:bCs w:val="1"/>
+          <w:rtl w:val="0"/>
+        </w:rPr>
+        <w:t xml:space="preserve">Author: </w:t>
+      </w:r>
+      <w:r>
+        <w:rPr>
+          <w:rtl w:val="0"/>
+        </w:rPr>
+        <w:t xml:space="preserve">Shaji Khan</w:t>
+      </w:r>
+    </w:p>
+    <w:p>
+      <w:pPr>
+        <w:rPr/>
+      </w:pPr>
+      <w:r>
+        <w:rPr>
+          <w:b w:val="1"/>
+          <w:bCs w:val="1"/>
+          <w:rtl w:val="0"/>
+        </w:rPr>
+        <w:t xml:space="preserve">Designation: </w:t>
+      </w:r>
+      <w:r>
+        <w:rPr>
+          <w:rtl w:val="0"/>
+        </w:rPr>
+        <w:t xml:space="preserve">Assistant Professor</w:t>
+      </w:r>
+    </w:p>
+    <w:p>
+      <w:pPr>
+        <w:rPr/>
+      </w:pPr>
+      <w:r>
+        <w:rPr>
+          <w:b w:val="1"/>
+          <w:bCs w:val="1"/>
+          <w:rtl w:val="0"/>
+        </w:rPr>
+        <w:t xml:space="preserve">Institution: </w:t>
+      </w:r>
+      <w:r>
+        <w:rPr>
+          <w:rtl w:val="0"/>
+        </w:rPr>
+        <w:t xml:space="preserve">Department of English, Govt SPMR College of Commerce Jammu, J&amp;K, India</w:t>
+      </w:r>
+    </w:p>
+    <w:p>
+      <w:pPr>
+        <w:rPr/>
+      </w:pPr>
+      <w:r>
+        <w:rPr>
+          <w:b w:val="1"/>
+          <w:bCs w:val="1"/>
+          <w:rtl w:val="0"/>
+        </w:rPr>
+        <w:t xml:space="preserve">Email: </w:t>
+      </w:r>
+      <w:r>
+        <w:rPr>
+          <w:rtl w:val="0"/>
+        </w:rPr>
+        <w:t xml:space="preserve">quotablecode@gmail.com</w:t>
       </w:r>
     </w:p>
     <w:p>

</xml_diff>

<commit_message>
Update binary documentation files for AGENT, README, and reports
</commit_message>
<xml_diff>
--- a/AGENT.md.docx
+++ b/AGENT.md.docx
@@ -103,7 +103,35 @@
         <w:rPr>
           <w:rtl w:val="0"/>
         </w:rPr>
-        <w:t xml:space="preserve">quotablecode@gmail.com</w:t>
+        <w:t xml:space="preserve">research@shaji.in</w:t>
+      </w:r>
+    </w:p>
+    <w:p>
+      <w:pPr>
+        <w:rPr/>
+      </w:pPr>
+      <w:r>
+        <w:rPr>
+          <w:b w:val="1"/>
+          <w:bCs w:val="1"/>
+          <w:rtl w:val="0"/>
+        </w:rPr>
+        <w:t xml:space="preserve">Website: </w:t>
+      </w:r>
+      <w:hyperlink r:id="rId6">
+        <w:r>
+          <w:rPr>
+            <w:color w:val="1155cc"/>
+            <w:u w:val="single"/>
+            <w:rtl w:val="0"/>
+          </w:rPr>
+          <w:t xml:space="preserve">https://shaji.in/research</w:t>
+        </w:r>
+      </w:hyperlink>
+      <w:r>
+        <w:rPr>
+          <w:rtl w:val="0"/>
+        </w:rPr>
       </w:r>
     </w:p>
     <w:p>

</xml_diff>